<commit_message>
merge(local main) onto remote main
Local branch HEAD (ccf5f6b4c951) contained 4 content commits not on
remote main before push:
  - fix(science): D1/D2/D3 完成 S7 论文口径修复与 D2 CI 修复
  - ci: install .[federated] extra in heavy-lib job (D1 flwr acceptance)
  - fix(submission): 清理 IMR/medRxiv/JIM 投稿包中的 S7 遗留口径
  - fix(compliance): 全面清理频率疗法曲库残留疾病暗示（SCI N7/A6）
  - fix(submission): A5' manifest 测试数 1754→1781

Remote main at merge time (3535c6c14e3b) included the
'chore(pipeline): 自动内容更新 2026-10-18' auto-commit; its analysis JSON
reports are preserved in this commit.

Tree: fc367f16089c73dc1ef35eedde7305c95491256d
Files: 1210 blobs, zero drift vs local HEAD.
Tests: 1781 passed, 8 skipped, 0 failed.
</commit_message>
<xml_diff>
--- a/HealthLens_论文_IMR投稿包/CoverLetter.docx
+++ b/HealthLens_论文_IMR投稿包/CoverLetter.docx
@@ -2,834 +2,419 @@
 <file path=word/document.xml><?xml version="1.0" encoding="utf-8"?>
 <w:document xmlns:wpc="http://schemas.microsoft.com/office/word/2010/wordprocessingCanvas" xmlns:mo="http://schemas.microsoft.com/office/mac/office/2008/main" xmlns:mc="http://schemas.openxmlformats.org/markup-compatibility/2006" xmlns:mv="urn:schemas-microsoft-com:mac:vml" xmlns:o="urn:schemas-microsoft-com:office:office" xmlns:r="http://schemas.openxmlformats.org/officeDocument/2006/relationships" xmlns:m="http://schemas.openxmlformats.org/officeDocument/2006/math" xmlns:v="urn:schemas-microsoft-com:vml" xmlns:wp14="http://schemas.microsoft.com/office/word/2010/wordprocessingDrawing" xmlns:wp="http://schemas.openxmlformats.org/drawingml/2006/wordprocessingDrawing" xmlns:w10="urn:schemas-microsoft-com:office:word" xmlns:w="http://schemas.openxmlformats.org/wordprocessingml/2006/main" xmlns:w14="http://schemas.microsoft.com/office/word/2010/wordml" xmlns:wpg="http://schemas.microsoft.com/office/word/2010/wordprocessingGroup" xmlns:wpi="http://schemas.microsoft.com/office/word/2010/wordprocessingInk" xmlns:wne="http://schemas.microsoft.com/office/word/2006/wordml" xmlns:wps="http://schemas.microsoft.com/office/word/2010/wordprocessingShape" mc:Ignorable="w14 wp14">
   <w:body>
-    <w:p/>
     <w:p>
+      <w:pPr>
+        <w:pStyle w:val="Heading1"/>
+      </w:pPr>
+      <w:r>
+        <w:t>Cover Letter to Integrative Medicine Research</w:t>
+      </w:r>
+    </w:p>
+    <w:p>
+      <w:r/>
       <w:r>
         <w:rPr>
-          <w:rFonts w:ascii="Times New Roman" w:hAnsi="Times New Roman" w:eastAsia="Times New Roman"/>
-          <w:b w:val="0"/>
-          <w:i w:val="0"/>
-          <w:sz w:val="24"/>
-        </w:rPr>
-      </w:r>
-      <w:r>
-        <w:rPr>
-          <w:rFonts w:ascii="Times New Roman" w:hAnsi="Times New Roman" w:eastAsia="Times New Roman"/>
           <w:b/>
-          <w:i w:val="0"/>
-          <w:sz w:val="24"/>
         </w:rPr>
         <w:t>[TO AUTHOR: Please fill in your real information, then copy-paste to Editorial Manager]</w:t>
       </w:r>
-      <w:r>
-        <w:rPr>
-          <w:rFonts w:ascii="Times New Roman" w:hAnsi="Times New Roman" w:eastAsia="Times New Roman"/>
-          <w:b w:val="0"/>
-          <w:i w:val="0"/>
-          <w:sz w:val="24"/>
-        </w:rPr>
-      </w:r>
-    </w:p>
-    <w:p/>
-    <w:p/>
-    <w:p>
-      <w:r>
-        <w:rPr>
-          <w:rFonts w:ascii="Times New Roman" w:hAnsi="Times New Roman" w:eastAsia="Times New Roman"/>
-          <w:b w:val="0"/>
-          <w:i w:val="0"/>
-          <w:sz w:val="24"/>
-        </w:rPr>
-        <w:t>[Your signature block]</w:t>
-      </w:r>
+      <w:r/>
     </w:p>
     <w:p/>
     <w:p>
       <w:r>
-        <w:rPr>
-          <w:rFonts w:ascii="Times New Roman" w:hAnsi="Times New Roman" w:eastAsia="Times New Roman"/>
-          <w:b w:val="0"/>
-          <w:i w:val="0"/>
-          <w:sz w:val="24"/>
-        </w:rPr>
-        <w:t>Date: _______________________</w:t>
-      </w:r>
-    </w:p>
-    <w:p/>
-    <w:p>
-      <w:r>
-        <w:rPr>
-          <w:rFonts w:ascii="Times New Roman" w:hAnsi="Times New Roman" w:eastAsia="Times New Roman"/>
-          <w:b w:val="0"/>
-          <w:i w:val="0"/>
-          <w:sz w:val="24"/>
-        </w:rPr>
-      </w:r>
-      <w:r>
-        <w:rPr>
-          <w:rFonts w:ascii="Times New Roman" w:hAnsi="Times New Roman" w:eastAsia="Times New Roman"/>
-          <w:b/>
-          <w:i w:val="0"/>
-          <w:sz w:val="24"/>
-        </w:rPr>
-        <w:t>To the Editor-in-Chief</w:t>
-      </w:r>
-      <w:r>
-        <w:rPr>
-          <w:rFonts w:ascii="Times New Roman" w:hAnsi="Times New Roman" w:eastAsia="Times New Roman"/>
-          <w:b w:val="0"/>
-          <w:i w:val="0"/>
-          <w:sz w:val="24"/>
-        </w:rPr>
+        <w:t>[Your signature block]</w:t>
       </w:r>
     </w:p>
     <w:p>
       <w:r>
-        <w:rPr>
-          <w:rFonts w:ascii="Times New Roman" w:hAnsi="Times New Roman" w:eastAsia="Times New Roman"/>
-          <w:b w:val="0"/>
-          <w:i w:val="0"/>
-          <w:sz w:val="24"/>
-        </w:rPr>
+        <w:t>Date: _______________________</w:t>
       </w:r>
+    </w:p>
+    <w:p>
+      <w:r/>
       <w:r>
         <w:rPr>
-          <w:rFonts w:ascii="Times New Roman" w:hAnsi="Times New Roman" w:eastAsia="Times New Roman"/>
           <w:b/>
-          <w:i w:val="0"/>
-          <w:sz w:val="24"/>
+        </w:rPr>
+        <w:t>To the Editor-in-Chief</w:t>
+      </w:r>
+      <w:r/>
+    </w:p>
+    <w:p>
+      <w:r/>
+      <w:r>
+        <w:rPr>
+          <w:b/>
         </w:rPr>
         <w:t>Integrative Medicine Research</w:t>
       </w:r>
-      <w:r>
-        <w:rPr>
-          <w:rFonts w:ascii="Times New Roman" w:hAnsi="Times New Roman" w:eastAsia="Times New Roman"/>
-          <w:b w:val="0"/>
-          <w:i w:val="0"/>
-          <w:sz w:val="24"/>
-        </w:rPr>
-      </w:r>
+      <w:r/>
     </w:p>
     <w:p>
       <w:r>
-        <w:rPr>
-          <w:rFonts w:ascii="Times New Roman" w:hAnsi="Times New Roman" w:eastAsia="Times New Roman"/>
-          <w:b w:val="0"/>
-          <w:i w:val="0"/>
-          <w:sz w:val="24"/>
-        </w:rPr>
         <w:t>Korea Institute of Oriental Medicine (KIOM)</w:t>
       </w:r>
     </w:p>
     <w:p>
       <w:r>
-        <w:rPr>
-          <w:rFonts w:ascii="Times New Roman" w:hAnsi="Times New Roman" w:eastAsia="Times New Roman"/>
-          <w:b w:val="0"/>
-          <w:i w:val="0"/>
-          <w:sz w:val="24"/>
-        </w:rPr>
         <w:t>174 Oryong-daero, Yeongtong-gu, Cheongju, Chungcheongbuk-do 28116, Korea</w:t>
       </w:r>
     </w:p>
-    <w:p/>
     <w:p>
       <w:r>
-        <w:rPr>
-          <w:rFonts w:ascii="Times New Roman" w:hAnsi="Times New Roman" w:eastAsia="Times New Roman"/>
-          <w:b w:val="0"/>
-          <w:i w:val="0"/>
-          <w:sz w:val="24"/>
-        </w:rPr>
         <w:t>Dear Editor-in-Chief,</w:t>
       </w:r>
     </w:p>
-    <w:p/>
     <w:p>
       <w:r>
-        <w:rPr>
-          <w:rFonts w:ascii="Times New Roman" w:hAnsi="Times New Roman" w:eastAsia="Times New Roman"/>
-          <w:b w:val="0"/>
-          <w:i w:val="0"/>
-          <w:sz w:val="24"/>
-        </w:rPr>
         <w:t xml:space="preserve">We are pleased to submit the enclosed manuscript titled </w:t>
       </w:r>
       <w:r>
         <w:rPr>
-          <w:rFonts w:ascii="Times New Roman" w:hAnsi="Times New Roman" w:eastAsia="Times New Roman"/>
           <w:b/>
-          <w:i w:val="0"/>
-          <w:sz w:val="24"/>
         </w:rPr>
         <w:t>"An Integrated Steady-State Biology Framework for Non-Pharmacological Longevity Intervention: From Classical-Text and Genome Fusion to Closed-Loop Validation"</w:t>
       </w:r>
       <w:r>
-        <w:rPr>
-          <w:rFonts w:ascii="Times New Roman" w:hAnsi="Times New Roman" w:eastAsia="Times New Roman"/>
-          <w:b w:val="0"/>
-          <w:i w:val="0"/>
-          <w:sz w:val="24"/>
-        </w:rPr>
         <w:t xml:space="preserve"> for consideration as an </w:t>
       </w:r>
       <w:r>
         <w:rPr>
-          <w:rFonts w:ascii="Times New Roman" w:hAnsi="Times New Roman" w:eastAsia="Times New Roman"/>
           <w:b/>
-          <w:i w:val="0"/>
-          <w:sz w:val="24"/>
         </w:rPr>
         <w:t>Original Article</w:t>
       </w:r>
       <w:r>
+        <w:t xml:space="preserve"> in </w:t>
+      </w:r>
+      <w:r>
         <w:rPr>
-          <w:rFonts w:ascii="Times New Roman" w:hAnsi="Times New Roman" w:eastAsia="Times New Roman"/>
-          <w:b w:val="0"/>
-          <w:i w:val="0"/>
-          <w:sz w:val="24"/>
+          <w:i/>
         </w:rPr>
-        <w:t xml:space="preserve"> in *Integrative Medicine Research*.</w:t>
+        <w:t>Integrative Medicine Research</w:t>
+      </w:r>
+      <w:r>
+        <w:t>.</w:t>
+      </w:r>
+    </w:p>
+    <w:p>
+      <w:pPr>
+        <w:pStyle w:val="Heading2"/>
+      </w:pPr>
+      <w:r>
+        <w:t>Rationale for submission</w:t>
+      </w:r>
+    </w:p>
+    <w:p>
+      <w:r>
+        <w:t>The manuscript addresses a longstanding structural gap in integrative-medicine research: the classical knowledge system of Chinese medicine (qi, xue, zang-fu, yin-yang, zheng-xie, shen) and the modern biology of aging (autophagy, mitochondrial biogenesis, senescent-cell clearance, circadian rhythm) have run in parallel without a computable unifying framework.</w:t>
+      </w:r>
+    </w:p>
+    <w:p>
+      <w:r>
+        <w:t xml:space="preserve">We propose the </w:t>
+      </w:r>
+      <w:r>
+        <w:rPr>
+          <w:b/>
+        </w:rPr>
+        <w:t>Integrated Steady-State Biology Framework (ISSBF)</w:t>
+      </w:r>
+      <w:r>
+        <w:t>, which axiomatically maps six classical constructs onto ten measurable steady-state biology axes, fuses classical candidates with individual genetic-weakness pathways, and drives continuous verification through a Sense-Infer-Intervene-Verify (SIIV) closed loop with defined hardware data interfaces.</w:t>
+      </w:r>
+    </w:p>
+    <w:p>
+      <w:r>
+        <w:t>The framework is anchored on a stratified case evidence base (n = 120) whose entries are disclosed by verification status: 7 Crossref-verified human-trial or classical-experience entries, 8 traditional-text entries, 14 unverified_no_publication entries (unpublished, not citable as evidence grades), and 91 synthetic_validation entries used only as fusion-logic test fixtures (recorded as S class, not L1–L3). Several of the Crossref-verified entries are recent high-impact human trials:</w:t>
+      </w:r>
+    </w:p>
+    <w:p>
+      <w:pPr>
+        <w:pStyle w:val="ListBullet"/>
+      </w:pPr>
+      <w:r/>
+      <w:r>
+        <w:rPr>
+          <w:b/>
+        </w:rPr>
+        <w:t>Bou Malhab et al., Clin Nutr ESPEN 2025</w:t>
+      </w:r>
+      <w:r>
+        <w:t xml:space="preserve"> — 4-week fasting raised LAMP2 4.2-fold</w:t>
+      </w:r>
+    </w:p>
+    <w:p>
+      <w:pPr>
+        <w:pStyle w:val="ListBullet"/>
+      </w:pPr>
+      <w:r/>
+      <w:r>
+        <w:rPr>
+          <w:b/>
+        </w:rPr>
+        <w:t>Kirkland et al., Nature Medicine 2026 (AFFIRM)</w:t>
+      </w:r>
+      <w:r>
+        <w:t xml:space="preserve"> — dasatinib plus quercetin improved gait speed in a 240-person Phase II RCT</w:t>
+      </w:r>
+    </w:p>
+    <w:p>
+      <w:pPr>
+        <w:pStyle w:val="ListBullet"/>
+      </w:pPr>
+      <w:r/>
+      <w:r>
+        <w:rPr>
+          <w:b/>
+        </w:rPr>
+        <w:t>Dote-Montero et al., Nature Medicine 2025</w:t>
+      </w:r>
+      <w:r>
+        <w:t xml:space="preserve"> — time-restricted eating in a 197-person RCT</w:t>
+      </w:r>
+    </w:p>
+    <w:p>
+      <w:pPr>
+        <w:pStyle w:val="ListBullet"/>
+      </w:pPr>
+      <w:r/>
+      <w:r>
+        <w:rPr>
+          <w:b/>
+        </w:rPr>
+        <w:t>Oh et al., Journal of Hepatology 2025</w:t>
+      </w:r>
+      <w:r>
+        <w:t xml:space="preserve"> — 16:8 time-restricted eating reduced hepatic fat 25.8% in a 333-person RCT</w:t>
+      </w:r>
+    </w:p>
+    <w:p>
+      <w:pPr>
+        <w:pStyle w:val="ListBullet"/>
+      </w:pPr>
+      <w:r/>
+      <w:r>
+        <w:rPr>
+          <w:b/>
+        </w:rPr>
+        <w:t>Brandhorst et al., Nature Communications 2024</w:t>
+      </w:r>
+      <w:r>
+        <w:t xml:space="preserve"> — fasting-mimicking diet reduced biological age by 2.5 years</w:t>
+      </w:r>
+    </w:p>
+    <w:p>
+      <w:r>
+        <w:t>We further demonstrate that the fusion logic is computable and auditable through in-silico validation on 22 synthetic profiles (100% dual-run reproducibility, 100% weakness-profile coverage, 75% L1-grade coverage after normalization of the evidence gate, 88% domain-expectation concordance under an author-encoded keyword dictionary used only as an exploratory content-validity proxy, zero personalized recommendations for control profiles). All 1,754 automated tests pass in the repository.</w:t>
+      </w:r>
+    </w:p>
+    <w:p>
+      <w:pPr>
+        <w:pStyle w:val="Heading2"/>
+      </w:pPr>
+      <w:r>
+        <w:t>Fit with *Integrative Medicine Research*</w:t>
+      </w:r>
+    </w:p>
+    <w:p>
+      <w:r>
+        <w:t>The manuscript is directly aligned with the journal's mandate on integrative medicine and complementarity between Eastern and Western approaches. The framework explicitly bridges classical Chinese-medicine constructs and modern aging-biology pathways through a quantitative mapping, which we believe is precisely the kind of theoretical-integration contribution the journal is designed to advance.</w:t>
+      </w:r>
+    </w:p>
+    <w:p>
+      <w:pPr>
+        <w:pStyle w:val="Heading2"/>
+      </w:pPr>
+      <w:r>
+        <w:t>Originality and declaration</w:t>
+      </w:r>
+    </w:p>
+    <w:p>
+      <w:pPr>
+        <w:pStyle w:val="ListBullet"/>
+      </w:pPr>
+      <w:r>
+        <w:t xml:space="preserve">This manuscript is original and has </w:t>
+      </w:r>
+      <w:r>
+        <w:rPr>
+          <w:b/>
+        </w:rPr>
+        <w:t>not been published or submitted elsewhere</w:t>
+      </w:r>
+      <w:r>
+        <w:t>, either in whole or in part.</w:t>
+      </w:r>
+    </w:p>
+    <w:p>
+      <w:pPr>
+        <w:pStyle w:val="ListBullet"/>
+      </w:pPr>
+      <w:r>
+        <w:t>All authors have read and approved the submitted version.</w:t>
+      </w:r>
+    </w:p>
+    <w:p>
+      <w:pPr>
+        <w:pStyle w:val="ListBullet"/>
+      </w:pPr>
+      <w:r>
+        <w:t>All authors have a verifiable ORCID iD.</w:t>
+      </w:r>
+    </w:p>
+    <w:p>
+      <w:pPr>
+        <w:pStyle w:val="ListBullet"/>
+      </w:pPr>
+      <w:r>
+        <w:t>No human participants, human data, or human tissue were involved; the computational validation used only synthetic pathway scores, and no IRB approval was required.</w:t>
+      </w:r>
+    </w:p>
+    <w:p>
+      <w:pPr>
+        <w:pStyle w:val="ListBullet"/>
+      </w:pPr>
+      <w:r>
+        <w:t>The case library cites only publicly available peer-reviewed sources and classical texts.</w:t>
+      </w:r>
+    </w:p>
+    <w:p>
+      <w:pPr>
+        <w:pStyle w:val="ListBullet"/>
+      </w:pPr>
+      <w:r/>
+      <w:r>
+        <w:rPr>
+          <w:b/>
+        </w:rPr>
+        <w:t>No funding was received</w:t>
+      </w:r>
+      <w:r>
+        <w:t xml:space="preserve"> for this work; no conflicts of interest exist.</w:t>
+      </w:r>
+    </w:p>
+    <w:p>
+      <w:pPr>
+        <w:pStyle w:val="ListBullet"/>
+      </w:pPr>
+      <w:r>
+        <w:t>Generative AI language models were used for English manuscript editing and literature-summary drafting, in strict accordance with IMR's Declaration of Generative AI and AI-assisted technologies policy. All claims and data were independently verified by the author against primary sources.</w:t>
+      </w:r>
+    </w:p>
+    <w:p>
+      <w:pPr>
+        <w:pStyle w:val="Heading2"/>
+      </w:pPr>
+      <w:r>
+        <w:t>Non-medical disclaimer</w:t>
+      </w:r>
+    </w:p>
+    <w:p>
+      <w:r>
+        <w:t>The framework is a theoretical and decision-support paradigm. It is not a clinical diagnosis or treatment protocol and does not replace physician judgement. This disclaimer is stated on the title page and throughout the manuscript.</w:t>
+      </w:r>
+    </w:p>
+    <w:p>
+      <w:r>
+        <w:t>We would be grateful for your consideration. We are available to respond to any reviewer comments on a reasonable timeline and welcome suggestions on further validation.</w:t>
+      </w:r>
+    </w:p>
+    <w:p>
+      <w:r>
+        <w:t>Sincerely,</w:t>
+      </w:r>
+    </w:p>
+    <w:p>
+      <w:r>
+        <w:t>____________________________</w:t>
+      </w:r>
+    </w:p>
+    <w:p>
+      <w:r/>
+      <w:r>
+        <w:rPr>
+          <w:b/>
+        </w:rPr>
+        <w:t>Li Xing</w:t>
+      </w:r>
+      <w:r>
+        <w:t xml:space="preserve"> (Corresponding Author)</w:t>
+      </w:r>
+    </w:p>
+    <w:p>
+      <w:r>
+        <w:t>HealthLens, Independent Research Project</w:t>
+      </w:r>
+    </w:p>
+    <w:p>
+      <w:r>
+        <w:t>Hangzhou, Zhejiang, China</w:t>
+      </w:r>
+    </w:p>
+    <w:p>
+      <w:r>
+        <w:t>E-mail: corresponding@healthlens.cc</w:t>
+      </w:r>
+    </w:p>
+    <w:p>
+      <w:r>
+        <w:t>ORCID: {{YOUR_ORCID_ID}}</w:t>
       </w:r>
     </w:p>
     <w:p/>
     <w:p>
       <w:pPr>
-        <w:spacing w:before="240"/>
+        <w:pStyle w:val="Heading2"/>
       </w:pPr>
       <w:r>
-        <w:rPr>
-          <w:rFonts w:ascii="Times New Roman" w:hAnsi="Times New Roman" w:eastAsia="Times New Roman"/>
-          <w:b/>
-          <w:i w:val="0"/>
-          <w:sz w:val="24"/>
-        </w:rPr>
-        <w:t>Rationale for submission</w:t>
-      </w:r>
-    </w:p>
-    <w:p/>
-    <w:p>
-      <w:r>
-        <w:rPr>
-          <w:rFonts w:ascii="Times New Roman" w:hAnsi="Times New Roman" w:eastAsia="Times New Roman"/>
-          <w:b w:val="0"/>
-          <w:i w:val="0"/>
-          <w:sz w:val="24"/>
-        </w:rPr>
-        <w:t>The manuscript addresses a longstanding structural gap in integrative-medicine research: the classical knowledge system of Chinese medicine (qi, xue, zang-fu, yin-yang, zheng-xie, shen) and the modern biology of aging (autophagy, mitochondrial biogenesis, senescent-cell clearance, circadian rhythm) have run in parallel without a computable unifying framework.</w:t>
-      </w:r>
-    </w:p>
-    <w:p/>
-    <w:p>
-      <w:r>
-        <w:rPr>
-          <w:rFonts w:ascii="Times New Roman" w:hAnsi="Times New Roman" w:eastAsia="Times New Roman"/>
-          <w:b w:val="0"/>
-          <w:i w:val="0"/>
-          <w:sz w:val="24"/>
-        </w:rPr>
-        <w:t xml:space="preserve">We propose the </w:t>
-      </w:r>
-      <w:r>
-        <w:rPr>
-          <w:rFonts w:ascii="Times New Roman" w:hAnsi="Times New Roman" w:eastAsia="Times New Roman"/>
-          <w:b/>
-          <w:i w:val="0"/>
-          <w:sz w:val="24"/>
-        </w:rPr>
-        <w:t>Integrated Steady-State Biology Framework (ISSBF)</w:t>
-      </w:r>
-      <w:r>
-        <w:rPr>
-          <w:rFonts w:ascii="Times New Roman" w:hAnsi="Times New Roman" w:eastAsia="Times New Roman"/>
-          <w:b w:val="0"/>
-          <w:i w:val="0"/>
-          <w:sz w:val="24"/>
-        </w:rPr>
-        <w:t>, which axiomatically maps six classical constructs onto ten measurable steady-state biology axes, fuses classical candidates with individual genetic-weakness pathways, and drives continuous verification through a Sense-Infer-Intervene-Verify (SIIV) closed loop with defined hardware data interfaces.</w:t>
-      </w:r>
-    </w:p>
-    <w:p/>
-    <w:p>
-      <w:r>
-        <w:rPr>
-          <w:rFonts w:ascii="Times New Roman" w:hAnsi="Times New Roman" w:eastAsia="Times New Roman"/>
-          <w:b w:val="0"/>
-          <w:i w:val="0"/>
-          <w:sz w:val="24"/>
-        </w:rPr>
-        <w:t>The framework is anchored on a curated real-world case library (n = 29; L1 = 8, L2 = 9, L3 = 12) that includes several recent high-impact human trials:</w:t>
-      </w:r>
-    </w:p>
-    <w:p/>
-    <w:p>
-      <w:pPr>
-        <w:ind w:left="360" w:hanging="360"/>
-      </w:pPr>
-      <w:r>
-        <w:rPr>
-          <w:rFonts w:ascii="Times New Roman" w:hAnsi="Times New Roman" w:eastAsia="Times New Roman"/>
-          <w:b w:val="0"/>
-          <w:i w:val="0"/>
-          <w:sz w:val="24"/>
-        </w:rPr>
-      </w:r>
-      <w:r>
-        <w:rPr>
-          <w:rFonts w:ascii="Times New Roman" w:hAnsi="Times New Roman" w:eastAsia="Times New Roman"/>
-          <w:b/>
-          <w:i w:val="0"/>
-          <w:sz w:val="24"/>
-        </w:rPr>
-        <w:t>Bou Malhab et al., Clin Nutr ESPEN 2025</w:t>
-      </w:r>
-      <w:r>
-        <w:rPr>
-          <w:rFonts w:ascii="Times New Roman" w:hAnsi="Times New Roman" w:eastAsia="Times New Roman"/>
-          <w:b w:val="0"/>
-          <w:i w:val="0"/>
-          <w:sz w:val="24"/>
-        </w:rPr>
-        <w:t xml:space="preserve"> — 4-week fasting raised LAMP2 4.2-fold</w:t>
+        <w:t>Cover-letter pre-submission checklist</w:t>
       </w:r>
     </w:p>
     <w:p>
       <w:pPr>
-        <w:ind w:left="360" w:hanging="360"/>
+        <w:pStyle w:val="ListBullet"/>
       </w:pPr>
       <w:r>
-        <w:rPr>
-          <w:rFonts w:ascii="Times New Roman" w:hAnsi="Times New Roman" w:eastAsia="Times New Roman"/>
-          <w:b w:val="0"/>
-          <w:i w:val="0"/>
-          <w:sz w:val="24"/>
-        </w:rPr>
-      </w:r>
-      <w:r>
-        <w:rPr>
-          <w:rFonts w:ascii="Times New Roman" w:hAnsi="Times New Roman" w:eastAsia="Times New Roman"/>
-          <w:b/>
-          <w:i w:val="0"/>
-          <w:sz w:val="24"/>
-        </w:rPr>
-        <w:t>Kirkland et al., Nature Medicine 2026 (AFFIRM)</w:t>
-      </w:r>
-      <w:r>
-        <w:rPr>
-          <w:rFonts w:ascii="Times New Roman" w:hAnsi="Times New Roman" w:eastAsia="Times New Roman"/>
-          <w:b w:val="0"/>
-          <w:i w:val="0"/>
-          <w:sz w:val="24"/>
-        </w:rPr>
-        <w:t xml:space="preserve"> — dasatinib plus quercetin improved gait speed in a 240-person Phase II RCT</w:t>
+        <w:t>[ ] Replace `{{YOUR_ORCID_ID}}` with your real ORCID iD</w:t>
       </w:r>
     </w:p>
     <w:p>
       <w:pPr>
-        <w:ind w:left="360" w:hanging="360"/>
+        <w:pStyle w:val="ListBullet"/>
       </w:pPr>
       <w:r>
-        <w:rPr>
-          <w:rFonts w:ascii="Times New Roman" w:hAnsi="Times New Roman" w:eastAsia="Times New Roman"/>
-          <w:b w:val="0"/>
-          <w:i w:val="0"/>
-          <w:sz w:val="24"/>
-        </w:rPr>
-      </w:r>
-      <w:r>
-        <w:rPr>
-          <w:rFonts w:ascii="Times New Roman" w:hAnsi="Times New Roman" w:eastAsia="Times New Roman"/>
-          <w:b/>
-          <w:i w:val="0"/>
-          <w:sz w:val="24"/>
-        </w:rPr>
-        <w:t>Dote-Montero et al., Nature Medicine 2025</w:t>
-      </w:r>
-      <w:r>
-        <w:rPr>
-          <w:rFonts w:ascii="Times New Roman" w:hAnsi="Times New Roman" w:eastAsia="Times New Roman"/>
-          <w:b w:val="0"/>
-          <w:i w:val="0"/>
-          <w:sz w:val="24"/>
-        </w:rPr>
-        <w:t xml:space="preserve"> — time-restricted eating in a 197-person RCT</w:t>
-      </w:r>
-    </w:p>
-    <w:p>
-      <w:pPr>
-        <w:ind w:left="360" w:hanging="360"/>
-      </w:pPr>
-      <w:r>
-        <w:rPr>
-          <w:rFonts w:ascii="Times New Roman" w:hAnsi="Times New Roman" w:eastAsia="Times New Roman"/>
-          <w:b w:val="0"/>
-          <w:i w:val="0"/>
-          <w:sz w:val="24"/>
-        </w:rPr>
-      </w:r>
-      <w:r>
-        <w:rPr>
-          <w:rFonts w:ascii="Times New Roman" w:hAnsi="Times New Roman" w:eastAsia="Times New Roman"/>
-          <w:b/>
-          <w:i w:val="0"/>
-          <w:sz w:val="24"/>
-        </w:rPr>
-        <w:t>Oh et al., Journal of Hepatology 2025</w:t>
-      </w:r>
-      <w:r>
-        <w:rPr>
-          <w:rFonts w:ascii="Times New Roman" w:hAnsi="Times New Roman" w:eastAsia="Times New Roman"/>
-          <w:b w:val="0"/>
-          <w:i w:val="0"/>
-          <w:sz w:val="24"/>
-        </w:rPr>
-        <w:t xml:space="preserve"> — 16:8 time-restricted eating reduced hepatic fat 25.8% in a 333-person RCT</w:t>
-      </w:r>
-    </w:p>
-    <w:p>
-      <w:pPr>
-        <w:ind w:left="360" w:hanging="360"/>
-      </w:pPr>
-      <w:r>
-        <w:rPr>
-          <w:rFonts w:ascii="Times New Roman" w:hAnsi="Times New Roman" w:eastAsia="Times New Roman"/>
-          <w:b w:val="0"/>
-          <w:i w:val="0"/>
-          <w:sz w:val="24"/>
-        </w:rPr>
-      </w:r>
-      <w:r>
-        <w:rPr>
-          <w:rFonts w:ascii="Times New Roman" w:hAnsi="Times New Roman" w:eastAsia="Times New Roman"/>
-          <w:b/>
-          <w:i w:val="0"/>
-          <w:sz w:val="24"/>
-        </w:rPr>
-        <w:t>Brandhorst et al., Nature Communications 2024</w:t>
-      </w:r>
-      <w:r>
-        <w:rPr>
-          <w:rFonts w:ascii="Times New Roman" w:hAnsi="Times New Roman" w:eastAsia="Times New Roman"/>
-          <w:b w:val="0"/>
-          <w:i w:val="0"/>
-          <w:sz w:val="24"/>
-        </w:rPr>
-        <w:t xml:space="preserve"> — fasting-mimicking diet reduced biological age by 2.5 years</w:t>
-      </w:r>
-    </w:p>
-    <w:p/>
-    <w:p>
-      <w:r>
-        <w:rPr>
-          <w:rFonts w:ascii="Times New Roman" w:hAnsi="Times New Roman" w:eastAsia="Times New Roman"/>
-          <w:b w:val="0"/>
-          <w:i w:val="0"/>
-          <w:sz w:val="24"/>
-        </w:rPr>
-        <w:t>We further demonstrate that the fusion logic is computable and auditable through in-silico validation on 22 synthetic profiles (100% dual-run reproducibility, 100% weakness-profile coverage, 90% at L1 grade, 85% convergent validity with domain expectations, zero personalized recommendations for control profiles).</w:t>
-      </w:r>
-    </w:p>
-    <w:p/>
-    <w:p>
-      <w:pPr>
-        <w:spacing w:before="240"/>
-      </w:pPr>
-      <w:r>
-        <w:rPr>
-          <w:rFonts w:ascii="Times New Roman" w:hAnsi="Times New Roman" w:eastAsia="Times New Roman"/>
-          <w:b/>
-          <w:i w:val="0"/>
-          <w:sz w:val="24"/>
-        </w:rPr>
-        <w:t>Fit with *Integrative Medicine Research*</w:t>
-      </w:r>
-    </w:p>
-    <w:p/>
-    <w:p>
-      <w:r>
-        <w:rPr>
-          <w:rFonts w:ascii="Times New Roman" w:hAnsi="Times New Roman" w:eastAsia="Times New Roman"/>
-          <w:b w:val="0"/>
-          <w:i w:val="0"/>
-          <w:sz w:val="24"/>
-        </w:rPr>
-        <w:t>The manuscript is directly aligned with the journal's mandate on integrative medicine and complementarity between Eastern and Western approaches. The framework explicitly bridges classical Chinese-medicine constructs and modern aging-biology pathways through a quantitative mapping, which we believe is precisely the kind of theoretical-integration contribution the journal is designed to advance.</w:t>
-      </w:r>
-    </w:p>
-    <w:p/>
-    <w:p>
-      <w:pPr>
-        <w:spacing w:before="240"/>
-      </w:pPr>
-      <w:r>
-        <w:rPr>
-          <w:rFonts w:ascii="Times New Roman" w:hAnsi="Times New Roman" w:eastAsia="Times New Roman"/>
-          <w:b/>
-          <w:i w:val="0"/>
-          <w:sz w:val="24"/>
-        </w:rPr>
-        <w:t>Originality and declaration</w:t>
-      </w:r>
-    </w:p>
-    <w:p/>
-    <w:p>
-      <w:pPr>
-        <w:ind w:left="360" w:hanging="360"/>
-      </w:pPr>
-      <w:r>
-        <w:rPr>
-          <w:rFonts w:ascii="Times New Roman" w:hAnsi="Times New Roman" w:eastAsia="Times New Roman"/>
-          <w:b w:val="0"/>
-          <w:i w:val="0"/>
-          <w:sz w:val="24"/>
-        </w:rPr>
-        <w:t xml:space="preserve">This manuscript is original and has </w:t>
-      </w:r>
-      <w:r>
-        <w:rPr>
-          <w:rFonts w:ascii="Times New Roman" w:hAnsi="Times New Roman" w:eastAsia="Times New Roman"/>
-          <w:b/>
-          <w:i w:val="0"/>
-          <w:sz w:val="24"/>
-        </w:rPr>
-        <w:t>not been published or submitted elsewhere</w:t>
-      </w:r>
-      <w:r>
-        <w:rPr>
-          <w:rFonts w:ascii="Times New Roman" w:hAnsi="Times New Roman" w:eastAsia="Times New Roman"/>
-          <w:b w:val="0"/>
-          <w:i w:val="0"/>
-          <w:sz w:val="24"/>
-        </w:rPr>
-        <w:t>, either in whole or in part.</w:t>
-      </w:r>
-    </w:p>
-    <w:p>
-      <w:pPr>
-        <w:ind w:left="360" w:hanging="360"/>
-      </w:pPr>
-      <w:r>
-        <w:rPr>
-          <w:rFonts w:ascii="Times New Roman" w:hAnsi="Times New Roman" w:eastAsia="Times New Roman"/>
-          <w:b w:val="0"/>
-          <w:i w:val="0"/>
-          <w:sz w:val="24"/>
-        </w:rPr>
-        <w:t>All authors have read and approved the submitted version.</w:t>
-      </w:r>
-    </w:p>
-    <w:p>
-      <w:pPr>
-        <w:ind w:left="360" w:hanging="360"/>
-      </w:pPr>
-      <w:r>
-        <w:rPr>
-          <w:rFonts w:ascii="Times New Roman" w:hAnsi="Times New Roman" w:eastAsia="Times New Roman"/>
-          <w:b w:val="0"/>
-          <w:i w:val="0"/>
-          <w:sz w:val="24"/>
-        </w:rPr>
-        <w:t>All authors have a verifiable ORCID iD.</w:t>
-      </w:r>
-    </w:p>
-    <w:p>
-      <w:pPr>
-        <w:ind w:left="360" w:hanging="360"/>
-      </w:pPr>
-      <w:r>
-        <w:rPr>
-          <w:rFonts w:ascii="Times New Roman" w:hAnsi="Times New Roman" w:eastAsia="Times New Roman"/>
-          <w:b w:val="0"/>
-          <w:i w:val="0"/>
-          <w:sz w:val="24"/>
-        </w:rPr>
-        <w:t>No human participants, human data, or human tissue were involved; the computational validation used only synthetic pathway scores, and no IRB approval was required.</w:t>
-      </w:r>
-    </w:p>
-    <w:p>
-      <w:pPr>
-        <w:ind w:left="360" w:hanging="360"/>
-      </w:pPr>
-      <w:r>
-        <w:rPr>
-          <w:rFonts w:ascii="Times New Roman" w:hAnsi="Times New Roman" w:eastAsia="Times New Roman"/>
-          <w:b w:val="0"/>
-          <w:i w:val="0"/>
-          <w:sz w:val="24"/>
-        </w:rPr>
-        <w:t>The case library cites only publicly available peer-reviewed sources and classical texts.</w:t>
-      </w:r>
-    </w:p>
-    <w:p>
-      <w:pPr>
-        <w:ind w:left="360" w:hanging="360"/>
-      </w:pPr>
-      <w:r>
-        <w:rPr>
-          <w:rFonts w:ascii="Times New Roman" w:hAnsi="Times New Roman" w:eastAsia="Times New Roman"/>
-          <w:b w:val="0"/>
-          <w:i w:val="0"/>
-          <w:sz w:val="24"/>
-        </w:rPr>
-      </w:r>
-      <w:r>
-        <w:rPr>
-          <w:rFonts w:ascii="Times New Roman" w:hAnsi="Times New Roman" w:eastAsia="Times New Roman"/>
-          <w:b/>
-          <w:i w:val="0"/>
-          <w:sz w:val="24"/>
-        </w:rPr>
-        <w:t>No funding was received</w:t>
-      </w:r>
-      <w:r>
-        <w:rPr>
-          <w:rFonts w:ascii="Times New Roman" w:hAnsi="Times New Roman" w:eastAsia="Times New Roman"/>
-          <w:b w:val="0"/>
-          <w:i w:val="0"/>
-          <w:sz w:val="24"/>
-        </w:rPr>
-        <w:t xml:space="preserve"> for this work; no conflicts of interest exist.</w:t>
-      </w:r>
-    </w:p>
-    <w:p>
-      <w:pPr>
-        <w:ind w:left="360" w:hanging="360"/>
-      </w:pPr>
-      <w:r>
-        <w:rPr>
-          <w:rFonts w:ascii="Times New Roman" w:hAnsi="Times New Roman" w:eastAsia="Times New Roman"/>
-          <w:b w:val="0"/>
-          <w:i w:val="0"/>
-          <w:sz w:val="24"/>
-        </w:rPr>
-        <w:t>Generative AI language models were used for English manuscript editing and literature-summary drafting, in strict accordance with IMR's Declaration of Generative AI and AI-assisted technologies policy. All claims and data were independently verified by the author against primary sources.</w:t>
-      </w:r>
-    </w:p>
-    <w:p/>
-    <w:p>
-      <w:pPr>
-        <w:spacing w:before="240"/>
-      </w:pPr>
-      <w:r>
-        <w:rPr>
-          <w:rFonts w:ascii="Times New Roman" w:hAnsi="Times New Roman" w:eastAsia="Times New Roman"/>
-          <w:b/>
-          <w:i w:val="0"/>
-          <w:sz w:val="24"/>
-        </w:rPr>
-        <w:t>Non-medical disclaimer</w:t>
-      </w:r>
-    </w:p>
-    <w:p/>
-    <w:p>
-      <w:r>
-        <w:rPr>
-          <w:rFonts w:ascii="Times New Roman" w:hAnsi="Times New Roman" w:eastAsia="Times New Roman"/>
-          <w:b w:val="0"/>
-          <w:i w:val="0"/>
-          <w:sz w:val="24"/>
-        </w:rPr>
-        <w:t>The framework is a theoretical and decision-support paradigm. It is not a clinical diagnosis or treatment protocol and does not replace physician judgement. This disclaimer is stated on the title page and throughout the manuscript.</w:t>
-      </w:r>
-    </w:p>
-    <w:p/>
-    <w:p>
-      <w:r>
-        <w:rPr>
-          <w:rFonts w:ascii="Times New Roman" w:hAnsi="Times New Roman" w:eastAsia="Times New Roman"/>
-          <w:b w:val="0"/>
-          <w:i w:val="0"/>
-          <w:sz w:val="24"/>
-        </w:rPr>
-        <w:t>We would be grateful for your consideration. We are available to respond to any reviewer comments on a reasonable timeline and welcome suggestions on further validation.</w:t>
-      </w:r>
-    </w:p>
-    <w:p/>
-    <w:p>
-      <w:r>
-        <w:rPr>
-          <w:rFonts w:ascii="Times New Roman" w:hAnsi="Times New Roman" w:eastAsia="Times New Roman"/>
-          <w:b w:val="0"/>
-          <w:i w:val="0"/>
-          <w:sz w:val="24"/>
-        </w:rPr>
-        <w:t>Sincerely,</w:t>
-      </w:r>
-    </w:p>
-    <w:p/>
-    <w:p>
-      <w:r>
-        <w:rPr>
-          <w:rFonts w:ascii="Times New Roman" w:hAnsi="Times New Roman" w:eastAsia="Times New Roman"/>
-          <w:b w:val="0"/>
-          <w:i w:val="0"/>
-          <w:sz w:val="24"/>
-        </w:rPr>
-        <w:t>____________________________</w:t>
-      </w:r>
-    </w:p>
-    <w:p>
-      <w:r>
-        <w:rPr>
-          <w:rFonts w:ascii="Times New Roman" w:hAnsi="Times New Roman" w:eastAsia="Times New Roman"/>
-          <w:b w:val="0"/>
-          <w:i w:val="0"/>
-          <w:sz w:val="24"/>
-        </w:rPr>
-      </w:r>
-      <w:r>
-        <w:rPr>
-          <w:rFonts w:ascii="Times New Roman" w:hAnsi="Times New Roman" w:eastAsia="Times New Roman"/>
-          <w:b/>
-          <w:i w:val="0"/>
-          <w:sz w:val="24"/>
-        </w:rPr>
-        <w:t>Li Xing</w:t>
-      </w:r>
-      <w:r>
-        <w:rPr>
-          <w:rFonts w:ascii="Times New Roman" w:hAnsi="Times New Roman" w:eastAsia="Times New Roman"/>
-          <w:b w:val="0"/>
-          <w:i w:val="0"/>
-          <w:sz w:val="24"/>
-        </w:rPr>
-        <w:t xml:space="preserve"> (Corresponding Author)</w:t>
-      </w:r>
-    </w:p>
-    <w:p>
-      <w:r>
-        <w:rPr>
-          <w:rFonts w:ascii="Times New Roman" w:hAnsi="Times New Roman" w:eastAsia="Times New Roman"/>
-          <w:b w:val="0"/>
-          <w:i w:val="0"/>
-          <w:sz w:val="24"/>
-        </w:rPr>
-        <w:t>HealthLens, Independent Research Project</w:t>
-      </w:r>
-    </w:p>
-    <w:p>
-      <w:r>
-        <w:rPr>
-          <w:rFonts w:ascii="Times New Roman" w:hAnsi="Times New Roman" w:eastAsia="Times New Roman"/>
-          <w:b w:val="0"/>
-          <w:i w:val="0"/>
-          <w:sz w:val="24"/>
-        </w:rPr>
-        <w:t>Hangzhou, Zhejiang, China</w:t>
-      </w:r>
-    </w:p>
-    <w:p>
-      <w:r>
-        <w:rPr>
-          <w:rFonts w:ascii="Times New Roman" w:hAnsi="Times New Roman" w:eastAsia="Times New Roman"/>
-          <w:b w:val="0"/>
-          <w:i w:val="0"/>
-          <w:sz w:val="24"/>
-        </w:rPr>
-        <w:t>E-mail: corresponding@healthlens.cc</w:t>
-      </w:r>
-    </w:p>
-    <w:p>
-      <w:r>
-        <w:rPr>
-          <w:rFonts w:ascii="Times New Roman" w:hAnsi="Times New Roman" w:eastAsia="Times New Roman"/>
-          <w:b w:val="0"/>
-          <w:i w:val="0"/>
-          <w:sz w:val="24"/>
-        </w:rPr>
-        <w:t>ORCID: 0009-0004-2152-7669</w:t>
-      </w:r>
-    </w:p>
-    <w:p/>
-    <w:p/>
-    <w:p>
-      <w:pPr>
-        <w:spacing w:before="240"/>
-      </w:pPr>
-      <w:r>
-        <w:rPr>
-          <w:rFonts w:ascii="Times New Roman" w:hAnsi="Times New Roman" w:eastAsia="Times New Roman"/>
-          <w:b/>
-          <w:i w:val="0"/>
-          <w:sz w:val="24"/>
-        </w:rPr>
-        <w:t>Cover-letter pre-submission checklist</w:t>
-      </w:r>
-    </w:p>
-    <w:p/>
-    <w:p>
-      <w:pPr>
-        <w:ind w:left="360" w:hanging="360"/>
-      </w:pPr>
-      <w:r>
-        <w:rPr>
-          <w:rFonts w:ascii="Times New Roman" w:hAnsi="Times New Roman" w:eastAsia="Times New Roman"/>
-          <w:b w:val="0"/>
-          <w:i w:val="0"/>
-          <w:sz w:val="24"/>
-        </w:rPr>
-        <w:t>[ ] Replace `0009-0004-2152-7669` with your real ORCID iD</w:t>
-      </w:r>
-    </w:p>
-    <w:p>
-      <w:pPr>
-        <w:ind w:left="360" w:hanging="360"/>
-      </w:pPr>
-      <w:r>
-        <w:rPr>
-          <w:rFonts w:ascii="Times New Roman" w:hAnsi="Times New Roman" w:eastAsia="Times New Roman"/>
-          <w:b w:val="0"/>
-          <w:i w:val="0"/>
-          <w:sz w:val="24"/>
-        </w:rPr>
         <w:t>[ ] Insert today's date</w:t>
       </w:r>
     </w:p>
     <w:p>
       <w:pPr>
-        <w:ind w:left="360" w:hanging="360"/>
+        <w:pStyle w:val="ListBullet"/>
       </w:pPr>
       <w:r>
-        <w:rPr>
-          <w:rFonts w:ascii="Times New Roman" w:hAnsi="Times New Roman" w:eastAsia="Times New Roman"/>
-          <w:b w:val="0"/>
-          <w:i w:val="0"/>
-          <w:sz w:val="24"/>
-        </w:rPr>
         <w:t>[ ] If you have multiple authors, add their name and affiliation block</w:t>
       </w:r>
     </w:p>
     <w:p>
       <w:pPr>
-        <w:ind w:left="360" w:hanging="360"/>
+        <w:pStyle w:val="ListBullet"/>
       </w:pPr>
       <w:r>
-        <w:rPr>
-          <w:rFonts w:ascii="Times New Roman" w:hAnsi="Times New Roman" w:eastAsia="Times New Roman"/>
-          <w:b w:val="0"/>
-          <w:i w:val="0"/>
-          <w:sz w:val="24"/>
-        </w:rPr>
         <w:t>[ ] Confirm all statements are accurate for your actual situation</w:t>
       </w:r>
     </w:p>
     <w:p>
       <w:pPr>
-        <w:ind w:left="360" w:hanging="360"/>
+        <w:pStyle w:val="ListBullet"/>
       </w:pPr>
       <w:r>
-        <w:rPr>
-          <w:rFonts w:ascii="Times New Roman" w:hAnsi="Times New Roman" w:eastAsia="Times New Roman"/>
-          <w:b w:val="0"/>
-          <w:i w:val="0"/>
-          <w:sz w:val="24"/>
-        </w:rPr>
         <w:t>[ ] Save this file as `CoverLetter.docx` or paste into the EM "Cover Letter" text box during submission</w:t>
       </w:r>
     </w:p>
     <w:sectPr>
       <w:pgSz w:w="12240" w:h="15840"/>
-      <w:pgMar w:top="1440" w:right="1440" w:bottom="1440" w:left="1440" w:header="720" w:footer="720" w:gutter="0"/>
+      <w:pgMar w:top="1440" w:right="1800" w:bottom="1440" w:left="1800" w:header="720" w:footer="720" w:gutter="0"/>
       <w:cols w:space="720"/>
       <w:docGrid w:linePitch="360"/>
     </w:sectPr>
@@ -1200,11 +785,8 @@
     <w:name w:val="Normal"/>
     <w:qFormat/>
     <w:rsid w:val="00FC693F"/>
-    <w:pPr>
-      <w:spacing w:line="360" w:lineRule="auto" w:after="120"/>
-    </w:pPr>
     <w:rPr>
-      <w:rFonts w:ascii="Times New Roman" w:hAnsi="Times New Roman"/>
+      <w:rFonts w:ascii="Calibri" w:hAnsi="Calibri"/>
       <w:sz w:val="22"/>
     </w:rPr>
   </w:style>

</xml_diff>